<commit_message>
Expand job workflow with cover letters, URL fetch, and applied tracking.
Add AIApply/Remote Rocketship parsers, resume eval harness, Gmail MCP, and richer job-detail UI.

Co-authored-by: Cursor <cursoragent@cursor.com>
</commit_message>
<xml_diff>
--- a/data/resume/Justin_Traille_Tailored.docx
+++ b/data/resume/Justin_Traille_Tailored.docx
@@ -16,7 +16,12 @@
       </w:r>
     </w:p>
     <w:p>
+      <w:pPr>
+        <w:pStyle w:val="Normal"/>
+        <w:rPr/>
+      </w:pPr>
       <w:r>
+        <w:rPr/>
         <w:t>Interactive Resume: https://ablackcloudapp.com/resume</w:t>
       </w:r>
     </w:p>
@@ -52,7 +57,8 @@
         <w:rPr/>
       </w:pPr>
       <w:r>
-        <w:t>Cloud Software Engineer with 5+ years of experience building and operating cloud infrastructure platforms across AWS, Azure, and GCP. Proven expertise in Infrastructure as Code (Terraform), Kubernetes orchestration, CI/CD pipeline automation, and platform engineering practices that enable self-service capabilities for application teams.</w:t>
+        <w:rPr/>
+        <w:t>Cloud Software Engineer with 5+ years of experience building AI-powered automation platforms, developer tooling, and cloud-native solutions using AWS, Python, Go, AWS Bedrock, LangChain, and Kubernetes. AWS Certified Solutions Architect – Professional with hands-on expertise in agentic AI workflows, Retrieval-Augmented Generation (RAG), vector databases, and full-stack development. Proven track record designing internal tools that reduce operational friction and accelerate engineering workflows.</w:t>
       </w:r>
     </w:p>
     <w:p>
@@ -92,7 +98,7 @@
       </w:pPr>
       <w:r>
         <w:rPr/>
-        <w:t>Programming: Python (Primary), Go (Primary), Bash, Java, JavaScript, GraphQL, SQL</w:t>
+        <w:t>Programming: Python (Primary), Go (Primary), Java, JavaScript, React, FastAPI, GraphQL, SQL</w:t>
       </w:r>
     </w:p>
     <w:p>
@@ -101,6 +107,7 @@
         <w:rPr/>
       </w:pPr>
       <w:r>
+        <w:rPr/>
         <w:t>Cloud: AWS (Primary), Azure</w:t>
       </w:r>
     </w:p>
@@ -111,7 +118,7 @@
       </w:pPr>
       <w:r>
         <w:rPr/>
-        <w:t>Infrastructure: Terraform (IaC), HCP Terraform, Kubernetes, Helm, Docker, Linux, CI/CD Pipelines, Git, Infrastructure Automation</w:t>
+        <w:t>Infrastructure: Terraform, HCP Terraform, Kubernetes, Helm, Docker, Linux, CI/CD, Git</w:t>
       </w:r>
     </w:p>
     <w:p>
@@ -121,7 +128,7 @@
       </w:pPr>
       <w:r>
         <w:rPr/>
-        <w:t>AI/ML: AWS Bedrock, LangChain, LangGraph, AI Agents, Retrieval-Augmented Generation (RAG), ChromaDB, Amazon Titan Embeddings, Semantic Search, Prompt Engineering, Vector Databases</w:t>
+        <w:t>AI/ML: AWS Bedrock (Claude), LangChain, LangGraph, AI Agents, Agentic Workflows, Retrieval-Augmented Generation (RAG), ChromaDB, Amazon Titan Embeddings, Semantic Search, Prompt Engineering, Vector Databases, MCP Integrations, AI Debugging</w:t>
       </w:r>
     </w:p>
     <w:p>
@@ -150,6 +157,7 @@
         <w:rPr/>
       </w:pPr>
       <w:r>
+        <w:rPr/>
         <w:t>Atos (Cloudreach) | Nov 2021 – Jun 2026</w:t>
       </w:r>
     </w:p>
@@ -160,7 +168,7 @@
       </w:pPr>
       <w:r>
         <w:rPr/>
-        <w:t>Software Engineer Consultant delivering platform engineering, cloud infrastructure automation, Infrastructure as Code, Kubernetes orchestration, CI/CD pipeline support, database modernization, and software development solutions for enterprise clients including Blackstone, OCC, Capital One, and Mayo Clinic.</w:t>
+        <w:t>Software Engineer Consultant delivering cloud engineering, platform engineering, Infrastructure as Code, Kubernetes, software development, database modernization, and AI-powered automation solutions for enterprise clients including Blackstone, OCC, Capital One, and Mayo Clinic.</w:t>
       </w:r>
     </w:p>
     <w:p>
@@ -169,6 +177,7 @@
         <w:rPr/>
       </w:pPr>
       <w:r>
+        <w:rPr/>
         <w:t>Atos Client: Blackstone | Jan 2022 – Apr 2023</w:t>
       </w:r>
     </w:p>
@@ -183,7 +192,7 @@
       </w:pPr>
       <w:r>
         <w:rPr/>
-        <w:t>Led platform migration from Terraform Enterprise to HCP Terraform, enabling self-service infrastructure provisioning for application teams.</w:t>
+        <w:t>Supported migration from Terraform Enterprise to HCP Terraform as part of the Platform Engineering team.</w:t>
       </w:r>
     </w:p>
     <w:p>
@@ -197,7 +206,7 @@
       </w:pPr>
       <w:r>
         <w:rPr/>
-        <w:t>Automated infrastructure management by importing AWS resources, users, teams, and platform components into Terraform-managed Infrastructure as Code workflows.</w:t>
+        <w:t>Imported AWS infrastructure, HCP Terraform users, teams, and platform resources into Terraform-managed Infrastructure as Code.</w:t>
       </w:r>
     </w:p>
     <w:p>
@@ -211,7 +220,7 @@
       </w:pPr>
       <w:r>
         <w:rPr/>
-        <w:t>Built Python-based automation using AWS Lambda and HCP Terraform API to provide self-service workspace provisioning through a React platform, abstracting infrastructure complexity for developers.</w:t>
+        <w:t>Developed Python AWS Lambda functions integrating with the HCP Terraform API to automate workspace lifecycle operations through a React-based self-service platform.</w:t>
       </w:r>
     </w:p>
     <w:p>
@@ -248,6 +257,7 @@
         <w:rPr/>
       </w:pPr>
       <w:r>
+        <w:rPr/>
         <w:t>Atos Client: The Options Clearing Corporation | Jun 2023 – Jun 2024</w:t>
       </w:r>
     </w:p>
@@ -304,7 +314,7 @@
       </w:pPr>
       <w:r>
         <w:rPr/>
-        <w:t>Contributed to Kubernetes platform engineering initiatives including cluster provisioning, application migrations, and platform modernization efforts.</w:t>
+        <w:t>Supported Kubernetes platform initiatives including cluster provisioning, migrations, and modernization.</w:t>
       </w:r>
     </w:p>
     <w:p>
@@ -313,6 +323,7 @@
         <w:rPr/>
       </w:pPr>
       <w:r>
+        <w:rPr/>
         <w:t>Atos Client: Capital One | Nov 2024 – Jun 2025</w:t>
       </w:r>
     </w:p>
@@ -327,7 +338,7 @@
       </w:pPr>
       <w:r>
         <w:rPr/>
-        <w:t>Led the first successful migration of Aurora PostgreSQL Global Clusters from a legacy Infrastructure as Code platform.</w:t>
+        <w:t>Led Aurora PostgreSQL Global Cluster migration from legacy Infrastructure as Code platform, coordinating production database changes through formal change management.</w:t>
       </w:r>
     </w:p>
     <w:p>
@@ -341,7 +352,7 @@
       </w:pPr>
       <w:r>
         <w:rPr/>
-        <w:t>Planned PostgreSQL major version upgrades, including multi-stage upgrade paths required by Aurora PostgreSQL.</w:t>
+        <w:t>Planned and executed PostgreSQL major version upgrades across multi-region Aurora deployments.</w:t>
       </w:r>
     </w:p>
     <w:p>
@@ -369,7 +380,7 @@
       </w:pPr>
       <w:r>
         <w:rPr/>
-        <w:t>Developed and validated Terraform configurations for multi-region Aurora PostgreSQL infrastructure deployments, ensuring reliable and repeatable provisioning.</w:t>
+        <w:t>Validated Terraform configurations for multi-region Aurora PostgreSQL deployments.</w:t>
       </w:r>
     </w:p>
     <w:p>
@@ -392,6 +403,7 @@
         <w:rPr/>
       </w:pPr>
       <w:r>
+        <w:rPr/>
         <w:t>Atos Client: Mayo Clinic | Mar 2026 – May 2026</w:t>
       </w:r>
     </w:p>
@@ -448,7 +460,7 @@
       </w:pPr>
       <w:r>
         <w:rPr/>
-        <w:t>Troubleshot and resolved Azure DevOps CI/CD pipeline failures and remediated security vulnerabilities to maintain deployment reliability.</w:t>
+        <w:t>Resolved Azure DevOps CI/CD pipeline issues and remediated security vulnerabilities.</w:t>
       </w:r>
     </w:p>
     <w:p>
@@ -462,7 +474,7 @@
       </w:pPr>
       <w:r>
         <w:rPr/>
-        <w:t>Leveraged Cursor AI to accelerate React development while maintaining code quality.</w:t>
+        <w:t>Leveraged Cursor AI (Claude-powered IDE) to accelerate React development, demonstrating practical experience using AI coding assistants to enhance developer productivity while maintaining code quality and architectural standards.</w:t>
       </w:r>
     </w:p>
     <w:p>
@@ -486,7 +498,7 @@
       </w:pPr>
       <w:r>
         <w:rPr/>
-        <w:t>Collaborated within a three-person team to build an AI-driven incident response platform using AWS Bedrock, Lambda, Step Functions, EventBridge, DynamoDB, ServiceNow, Slack, and CloudWatch.</w:t>
+        <w:t>Designed and built an event-driven AI agent orchestration platform using AWS Bedrock, Lambda, Step Functions, EventBridge, DynamoDB, ServiceNow, Slack, and CloudWatch to automate incident detection, context gathering, root cause analysis, remediation recommendations, validation plans, and rollback procedures.</w:t>
       </w:r>
     </w:p>
     <w:p>
@@ -500,7 +512,7 @@
       </w:pPr>
       <w:r>
         <w:rPr/>
-        <w:t>Automated incident investigation workflows and generated AI-powered summaries, remediation recommendations, rollback plans, and validation procedures.</w:t>
+        <w:t>Implemented agentic workflows that automatically collect operational context from multiple systems, perform AI-assisted root cause investigation, generate actionable remediation guidance, and coordinate response activities through ITSM and collaboration tools.</w:t>
       </w:r>
     </w:p>
     <w:p>
@@ -514,7 +526,7 @@
       </w:pPr>
       <w:r>
         <w:rPr/>
-        <w:t>Implemented integrations with AWS DevOps Agent capabilities.</w:t>
+        <w:t>Architected non-deterministic AI systems requiring iterative debugging, prompt refinement, and resilient error handling to ensure reliable automation in production incident response scenarios.</w:t>
       </w:r>
     </w:p>
     <w:p>
@@ -537,94 +549,233 @@
         <w:rPr/>
       </w:pPr>
       <w:r>
+        <w:rPr/>
         <w:t>AI &amp; Cloud Projects</w:t>
       </w:r>
     </w:p>
     <w:p>
       <w:pPr>
         <w:pStyle w:val="Heading2"/>
+        <w:rPr/>
       </w:pPr>
       <w:r>
+        <w:rPr/>
         <w:t>AI Agent-Powered RAG Platform</w:t>
       </w:r>
     </w:p>
     <w:p>
       <w:pPr>
         <w:pStyle w:val="ListBullet"/>
+        <w:numPr>
+          <w:ilvl w:val="0"/>
+          <w:numId w:val="1"/>
+        </w:numPr>
+        <w:rPr/>
       </w:pPr>
       <w:r>
-        <w:t>Designed and developed an AI agent-powered RAG application using Python, AWS Bedrock, LangChain, LangGraph, ChromaDB, and Amazon Titan Embeddings.</w:t>
+        <w:rPr/>
+        <w:t>Designed and developed an end-to-end RAG application using Python, AWS Bedrock, LangChain, LangGraph, ChromaDB, and Amazon Titan Embeddings to explore AI agent orchestration, semantic search, and grounded LLM response generation.</w:t>
       </w:r>
     </w:p>
     <w:p>
       <w:pPr>
         <w:pStyle w:val="ListBullet"/>
+        <w:numPr>
+          <w:ilvl w:val="0"/>
+          <w:numId w:val="1"/>
+        </w:numPr>
+        <w:rPr/>
       </w:pPr>
       <w:r>
+        <w:rPr/>
         <w:t>Built a document ingestion pipeline to process PDFs, generate semantic embeddings, and store vectors in ChromaDB.</w:t>
       </w:r>
     </w:p>
     <w:p>
       <w:pPr>
         <w:pStyle w:val="ListBullet"/>
+        <w:numPr>
+          <w:ilvl w:val="0"/>
+          <w:numId w:val="1"/>
+        </w:numPr>
+        <w:rPr/>
       </w:pPr>
       <w:r>
+        <w:rPr/>
         <w:t>Integrated Amazon Bedrock foundation models to generate context-aware responses using semantic search and grounded LLM workflows.</w:t>
       </w:r>
     </w:p>
     <w:p>
       <w:pPr>
         <w:pStyle w:val="ListBullet"/>
+        <w:numPr>
+          <w:ilvl w:val="0"/>
+          <w:numId w:val="1"/>
+        </w:numPr>
+        <w:rPr/>
       </w:pPr>
       <w:r>
+        <w:rPr/>
         <w:t>GitHub: https://github.com/TheTraille18/jet_rag_ai_project</w:t>
       </w:r>
     </w:p>
     <w:p>
       <w:pPr>
         <w:pStyle w:val="Heading2"/>
+        <w:rPr/>
       </w:pPr>
       <w:r>
+        <w:rPr/>
+        <w:t>CareerPilot AI</w:t>
+      </w:r>
+    </w:p>
+    <w:p>
+      <w:pPr>
+        <w:pStyle w:val="ListBullet"/>
+        <w:numPr>
+          <w:ilvl w:val="0"/>
+          <w:numId w:val="1"/>
+        </w:numPr>
+        <w:rPr/>
+      </w:pPr>
+      <w:r>
+        <w:rPr/>
+        <w:t>Designed and developed CareerPilot AI, an AI-powered career optimization platform that tailors resumes and cover letters to specific job descriptions while preserving original DOCX formatting.</w:t>
+      </w:r>
+    </w:p>
+    <w:p>
+      <w:pPr>
+        <w:pStyle w:val="ListBullet"/>
+        <w:numPr>
+          <w:ilvl w:val="0"/>
+          <w:numId w:val="1"/>
+        </w:numPr>
+        <w:rPr/>
+      </w:pPr>
+      <w:r>
+        <w:rPr/>
+        <w:t>Built a production-grade Retrieval-Augmented Generation (RAG) pipeline using Python, FastAPI, AWS Bedrock, LangChain, ChromaDB, and Amazon Titan Embeddings to retrieve semantically relevant resume knowledge, ensuring AI-generated outputs remain factually grounded and avoid hallucinations.</w:t>
+      </w:r>
+    </w:p>
+    <w:p>
+      <w:pPr>
+        <w:pStyle w:val="ListBullet"/>
+        <w:numPr>
+          <w:ilvl w:val="0"/>
+          <w:numId w:val="1"/>
+        </w:numPr>
+        <w:rPr/>
+      </w:pPr>
+      <w:r>
+        <w:rPr/>
+        <w:t>Developed REST APIs with FastAPI supporting document ingestion, semantic retrieval, AI-powered content generation, and structured output validation, demonstrating full-stack development across backend services and AI orchestration layers.</w:t>
+      </w:r>
+    </w:p>
+    <w:p>
+      <w:pPr>
+        <w:pStyle w:val="ListBullet"/>
+        <w:numPr>
+          <w:ilvl w:val="0"/>
+          <w:numId w:val="1"/>
+        </w:numPr>
+        <w:rPr/>
+      </w:pPr>
+      <w:r>
+        <w:rPr/>
+        <w:t>Implemented structured data parsing, JSON knowledge schemas, vector embeddings, and document-aware editing to ensure AI outputs preserve formatting, maintain factual accuracy, and avoid fabricating information—demonstrating pragmatic approaches to AI reliability and user trust.</w:t>
+      </w:r>
+    </w:p>
+    <w:p>
+      <w:pPr>
+        <w:pStyle w:val="ListBullet"/>
+        <w:numPr>
+          <w:ilvl w:val="0"/>
+          <w:numId w:val="1"/>
+        </w:numPr>
+        <w:rPr/>
+      </w:pPr>
+      <w:r>
+        <w:rPr/>
+        <w:t>Developing support for job analysis, skills-gap identification, interview preparation, and knowledge graph integration.</w:t>
+      </w:r>
+    </w:p>
+    <w:p>
+      <w:pPr>
+        <w:pStyle w:val="Heading2"/>
+        <w:rPr/>
+      </w:pPr>
+      <w:r>
+        <w:rPr/>
         <w:t>KubeSentry AI (In Progress)</w:t>
       </w:r>
     </w:p>
     <w:p>
       <w:pPr>
         <w:pStyle w:val="ListBullet"/>
+        <w:numPr>
+          <w:ilvl w:val="0"/>
+          <w:numId w:val="1"/>
+        </w:numPr>
+        <w:rPr/>
       </w:pPr>
       <w:r>
-        <w:t>Developing an AI-powered Kubernetes troubleshooting platform using Go, Kubernetes (client-go), AWS Bedrock, and Retrieval-Augmented Generation (RAG).</w:t>
+        <w:rPr/>
+        <w:t>Developing an AI-powered Kubernetes troubleshooting platform using Go, Kubernetes (client-go), AWS Bedrock (Claude), and Retrieval-Augmented Generation (RAG) to automate incident detection, diagnostic evidence collection, and intelligent root cause analysis.</w:t>
       </w:r>
     </w:p>
     <w:p>
       <w:pPr>
         <w:pStyle w:val="ListBullet"/>
+        <w:numPr>
+          <w:ilvl w:val="0"/>
+          <w:numId w:val="1"/>
+        </w:numPr>
+        <w:rPr/>
       </w:pPr>
       <w:r>
-        <w:t>Designing an agent-based architecture with shared state, planner logic, and modular workflow nodes to automate Kubernetes incident investigations.</w:t>
+        <w:rPr/>
+        <w:t>Designing a LangGraph-style agent orchestration architecture with shared state, planner logic, and modular tool execution to enable autonomous investigation workflows, demonstrating hands-on experience building agentic systems from the ground up.</w:t>
       </w:r>
     </w:p>
     <w:p>
       <w:pPr>
         <w:pStyle w:val="ListBullet"/>
+        <w:numPr>
+          <w:ilvl w:val="0"/>
+          <w:numId w:val="1"/>
+        </w:numPr>
+        <w:rPr/>
       </w:pPr>
       <w:r>
-        <w:t>Building a modular AI agent framework for Kubernetes diagnostics and intelligent root cause analysis.</w:t>
+        <w:rPr/>
+        <w:t>Building modular AI agent tools and skills for Kubernetes diagnostics, including log retrieval, event analysis, and pod inspection, with plans to integrate RAG-backed runbooks and incident memory for continuous learning.</w:t>
       </w:r>
     </w:p>
     <w:p>
       <w:pPr>
         <w:pStyle w:val="ListBullet"/>
+        <w:numPr>
+          <w:ilvl w:val="0"/>
+          <w:numId w:val="1"/>
+        </w:numPr>
+        <w:rPr/>
       </w:pPr>
       <w:r>
+        <w:rPr/>
         <w:t>GitHub: https://github.com/TheTraille18/kubeSentryAI</w:t>
       </w:r>
     </w:p>
     <w:p>
       <w:pPr>
         <w:pStyle w:val="ListBullet"/>
+        <w:numPr>
+          <w:ilvl w:val="0"/>
+          <w:numId w:val="1"/>
+        </w:numPr>
+        <w:rPr/>
       </w:pPr>
       <w:r>
+        <w:rPr/>
         <w:t>Portfolio: ablackcloudapp.com</w:t>
       </w:r>
     </w:p>
@@ -641,16 +792,28 @@
     <w:p>
       <w:pPr>
         <w:pStyle w:val="ListBullet"/>
+        <w:numPr>
+          <w:ilvl w:val="0"/>
+          <w:numId w:val="1"/>
+        </w:numPr>
+        <w:rPr/>
       </w:pPr>
       <w:r>
+        <w:rPr/>
         <w:t>Kapsch TrafficCom (2015–2021): Staff System Engineer developing Java applications and automation solutions for intelligent transportation systems.</w:t>
       </w:r>
     </w:p>
     <w:p>
       <w:pPr>
         <w:pStyle w:val="ListBullet"/>
+        <w:numPr>
+          <w:ilvl w:val="0"/>
+          <w:numId w:val="1"/>
+        </w:numPr>
+        <w:rPr/>
       </w:pPr>
       <w:r>
+        <w:rPr/>
         <w:t>Logical Systems Inc. (2012–2015): Control System Engineer developing industrial automation and control system solutions.</w:t>
       </w:r>
     </w:p>
@@ -720,6 +883,7 @@
         </w:tabs>
         <w:ind w:start="1080" w:hanging="360"/>
       </w:pPr>
+      <w:rPr/>
     </w:lvl>
     <w:lvl w:ilvl="2">
       <w:start w:val="1"/>
@@ -732,6 +896,7 @@
         </w:tabs>
         <w:ind w:start="1440" w:hanging="360"/>
       </w:pPr>
+      <w:rPr/>
     </w:lvl>
     <w:lvl w:ilvl="3">
       <w:start w:val="1"/>
@@ -744,6 +909,7 @@
         </w:tabs>
         <w:ind w:start="1800" w:hanging="360"/>
       </w:pPr>
+      <w:rPr/>
     </w:lvl>
     <w:lvl w:ilvl="4">
       <w:start w:val="1"/>
@@ -756,6 +922,7 @@
         </w:tabs>
         <w:ind w:start="2160" w:hanging="360"/>
       </w:pPr>
+      <w:rPr/>
     </w:lvl>
     <w:lvl w:ilvl="5">
       <w:start w:val="1"/>
@@ -768,6 +935,7 @@
         </w:tabs>
         <w:ind w:start="2520" w:hanging="360"/>
       </w:pPr>
+      <w:rPr/>
     </w:lvl>
     <w:lvl w:ilvl="6">
       <w:start w:val="1"/>
@@ -780,6 +948,7 @@
         </w:tabs>
         <w:ind w:start="2880" w:hanging="360"/>
       </w:pPr>
+      <w:rPr/>
     </w:lvl>
     <w:lvl w:ilvl="7">
       <w:start w:val="1"/>
@@ -792,6 +961,7 @@
         </w:tabs>
         <w:ind w:start="3240" w:hanging="360"/>
       </w:pPr>
+      <w:rPr/>
     </w:lvl>
     <w:lvl w:ilvl="8">
       <w:start w:val="1"/>
@@ -804,6 +974,7 @@
         </w:tabs>
         <w:ind w:start="3600" w:hanging="360"/>
       </w:pPr>
+      <w:rPr/>
     </w:lvl>
   </w:abstractNum>
   <w:abstractNum w:abstractNumId="2">
@@ -833,6 +1004,7 @@
         </w:tabs>
         <w:ind w:start="1080" w:hanging="360"/>
       </w:pPr>
+      <w:rPr/>
     </w:lvl>
     <w:lvl w:ilvl="2">
       <w:start w:val="1"/>
@@ -845,6 +1017,7 @@
         </w:tabs>
         <w:ind w:start="1440" w:hanging="360"/>
       </w:pPr>
+      <w:rPr/>
     </w:lvl>
     <w:lvl w:ilvl="3">
       <w:start w:val="1"/>
@@ -857,6 +1030,7 @@
         </w:tabs>
         <w:ind w:start="1800" w:hanging="360"/>
       </w:pPr>
+      <w:rPr/>
     </w:lvl>
     <w:lvl w:ilvl="4">
       <w:start w:val="1"/>
@@ -869,6 +1043,7 @@
         </w:tabs>
         <w:ind w:start="2160" w:hanging="360"/>
       </w:pPr>
+      <w:rPr/>
     </w:lvl>
     <w:lvl w:ilvl="5">
       <w:start w:val="1"/>
@@ -881,6 +1056,7 @@
         </w:tabs>
         <w:ind w:start="2520" w:hanging="360"/>
       </w:pPr>
+      <w:rPr/>
     </w:lvl>
     <w:lvl w:ilvl="6">
       <w:start w:val="1"/>
@@ -893,6 +1069,7 @@
         </w:tabs>
         <w:ind w:start="2880" w:hanging="360"/>
       </w:pPr>
+      <w:rPr/>
     </w:lvl>
     <w:lvl w:ilvl="7">
       <w:start w:val="1"/>
@@ -905,6 +1082,7 @@
         </w:tabs>
         <w:ind w:start="3240" w:hanging="360"/>
       </w:pPr>
+      <w:rPr/>
     </w:lvl>
     <w:lvl w:ilvl="8">
       <w:start w:val="1"/>
@@ -917,6 +1095,7 @@
         </w:tabs>
         <w:ind w:start="3600" w:hanging="360"/>
       </w:pPr>
+      <w:rPr/>
     </w:lvl>
   </w:abstractNum>
   <w:abstractNum w:abstractNumId="3">
@@ -946,6 +1125,7 @@
         </w:tabs>
         <w:ind w:start="1080" w:hanging="360"/>
       </w:pPr>
+      <w:rPr/>
     </w:lvl>
     <w:lvl w:ilvl="2">
       <w:start w:val="1"/>
@@ -958,6 +1138,7 @@
         </w:tabs>
         <w:ind w:start="1440" w:hanging="360"/>
       </w:pPr>
+      <w:rPr/>
     </w:lvl>
     <w:lvl w:ilvl="3">
       <w:start w:val="1"/>
@@ -970,6 +1151,7 @@
         </w:tabs>
         <w:ind w:start="1800" w:hanging="360"/>
       </w:pPr>
+      <w:rPr/>
     </w:lvl>
     <w:lvl w:ilvl="4">
       <w:start w:val="1"/>
@@ -982,6 +1164,7 @@
         </w:tabs>
         <w:ind w:start="2160" w:hanging="360"/>
       </w:pPr>
+      <w:rPr/>
     </w:lvl>
     <w:lvl w:ilvl="5">
       <w:start w:val="1"/>
@@ -994,6 +1177,7 @@
         </w:tabs>
         <w:ind w:start="2520" w:hanging="360"/>
       </w:pPr>
+      <w:rPr/>
     </w:lvl>
     <w:lvl w:ilvl="6">
       <w:start w:val="1"/>
@@ -1006,6 +1190,7 @@
         </w:tabs>
         <w:ind w:start="2880" w:hanging="360"/>
       </w:pPr>
+      <w:rPr/>
     </w:lvl>
     <w:lvl w:ilvl="7">
       <w:start w:val="1"/>
@@ -1018,6 +1203,7 @@
         </w:tabs>
         <w:ind w:start="3240" w:hanging="360"/>
       </w:pPr>
+      <w:rPr/>
     </w:lvl>
     <w:lvl w:ilvl="8">
       <w:start w:val="1"/>
@@ -1030,6 +1216,7 @@
         </w:tabs>
         <w:ind w:start="3600" w:hanging="360"/>
       </w:pPr>
+      <w:rPr/>
     </w:lvl>
   </w:abstractNum>
   <w:abstractNum w:abstractNumId="4">
@@ -1057,6 +1244,7 @@
         </w:tabs>
         <w:ind w:start="1080" w:hanging="360"/>
       </w:pPr>
+      <w:rPr/>
     </w:lvl>
     <w:lvl w:ilvl="2">
       <w:start w:val="1"/>
@@ -1069,6 +1257,7 @@
         </w:tabs>
         <w:ind w:start="1440" w:hanging="360"/>
       </w:pPr>
+      <w:rPr/>
     </w:lvl>
     <w:lvl w:ilvl="3">
       <w:start w:val="1"/>
@@ -1081,6 +1270,7 @@
         </w:tabs>
         <w:ind w:start="1800" w:hanging="360"/>
       </w:pPr>
+      <w:rPr/>
     </w:lvl>
     <w:lvl w:ilvl="4">
       <w:start w:val="1"/>
@@ -1093,6 +1283,7 @@
         </w:tabs>
         <w:ind w:start="2160" w:hanging="360"/>
       </w:pPr>
+      <w:rPr/>
     </w:lvl>
     <w:lvl w:ilvl="5">
       <w:start w:val="1"/>
@@ -1105,6 +1296,7 @@
         </w:tabs>
         <w:ind w:start="2520" w:hanging="360"/>
       </w:pPr>
+      <w:rPr/>
     </w:lvl>
     <w:lvl w:ilvl="6">
       <w:start w:val="1"/>
@@ -1117,6 +1309,7 @@
         </w:tabs>
         <w:ind w:start="2880" w:hanging="360"/>
       </w:pPr>
+      <w:rPr/>
     </w:lvl>
     <w:lvl w:ilvl="7">
       <w:start w:val="1"/>
@@ -1129,6 +1322,7 @@
         </w:tabs>
         <w:ind w:start="3240" w:hanging="360"/>
       </w:pPr>
+      <w:rPr/>
     </w:lvl>
     <w:lvl w:ilvl="8">
       <w:start w:val="1"/>
@@ -1141,6 +1335,7 @@
         </w:tabs>
         <w:ind w:start="3600" w:hanging="360"/>
       </w:pPr>
+      <w:rPr/>
     </w:lvl>
   </w:abstractNum>
   <w:abstractNum w:abstractNumId="5">
@@ -1168,6 +1363,7 @@
         </w:tabs>
         <w:ind w:start="1080" w:hanging="360"/>
       </w:pPr>
+      <w:rPr/>
     </w:lvl>
     <w:lvl w:ilvl="2">
       <w:start w:val="1"/>
@@ -1180,6 +1376,7 @@
         </w:tabs>
         <w:ind w:start="1440" w:hanging="360"/>
       </w:pPr>
+      <w:rPr/>
     </w:lvl>
     <w:lvl w:ilvl="3">
       <w:start w:val="1"/>
@@ -1192,6 +1389,7 @@
         </w:tabs>
         <w:ind w:start="1800" w:hanging="360"/>
       </w:pPr>
+      <w:rPr/>
     </w:lvl>
     <w:lvl w:ilvl="4">
       <w:start w:val="1"/>
@@ -1204,6 +1402,7 @@
         </w:tabs>
         <w:ind w:start="2160" w:hanging="360"/>
       </w:pPr>
+      <w:rPr/>
     </w:lvl>
     <w:lvl w:ilvl="5">
       <w:start w:val="1"/>
@@ -1216,6 +1415,7 @@
         </w:tabs>
         <w:ind w:start="2520" w:hanging="360"/>
       </w:pPr>
+      <w:rPr/>
     </w:lvl>
     <w:lvl w:ilvl="6">
       <w:start w:val="1"/>
@@ -1228,6 +1428,7 @@
         </w:tabs>
         <w:ind w:start="2880" w:hanging="360"/>
       </w:pPr>
+      <w:rPr/>
     </w:lvl>
     <w:lvl w:ilvl="7">
       <w:start w:val="1"/>
@@ -1240,6 +1441,7 @@
         </w:tabs>
         <w:ind w:start="3240" w:hanging="360"/>
       </w:pPr>
+      <w:rPr/>
     </w:lvl>
     <w:lvl w:ilvl="8">
       <w:start w:val="1"/>
@@ -1252,6 +1454,7 @@
         </w:tabs>
         <w:ind w:start="3600" w:hanging="360"/>
       </w:pPr>
+      <w:rPr/>
     </w:lvl>
   </w:abstractNum>
   <w:abstractNum w:abstractNumId="6">
@@ -1279,6 +1482,7 @@
         </w:tabs>
         <w:ind w:start="1080" w:hanging="360"/>
       </w:pPr>
+      <w:rPr/>
     </w:lvl>
     <w:lvl w:ilvl="2">
       <w:start w:val="1"/>
@@ -1291,6 +1495,7 @@
         </w:tabs>
         <w:ind w:start="1440" w:hanging="360"/>
       </w:pPr>
+      <w:rPr/>
     </w:lvl>
     <w:lvl w:ilvl="3">
       <w:start w:val="1"/>
@@ -1303,6 +1508,7 @@
         </w:tabs>
         <w:ind w:start="1800" w:hanging="360"/>
       </w:pPr>
+      <w:rPr/>
     </w:lvl>
     <w:lvl w:ilvl="4">
       <w:start w:val="1"/>
@@ -1315,6 +1521,7 @@
         </w:tabs>
         <w:ind w:start="2160" w:hanging="360"/>
       </w:pPr>
+      <w:rPr/>
     </w:lvl>
     <w:lvl w:ilvl="5">
       <w:start w:val="1"/>
@@ -1327,6 +1534,7 @@
         </w:tabs>
         <w:ind w:start="2520" w:hanging="360"/>
       </w:pPr>
+      <w:rPr/>
     </w:lvl>
     <w:lvl w:ilvl="6">
       <w:start w:val="1"/>
@@ -1339,6 +1547,7 @@
         </w:tabs>
         <w:ind w:start="2880" w:hanging="360"/>
       </w:pPr>
+      <w:rPr/>
     </w:lvl>
     <w:lvl w:ilvl="7">
       <w:start w:val="1"/>
@@ -1351,6 +1560,7 @@
         </w:tabs>
         <w:ind w:start="3240" w:hanging="360"/>
       </w:pPr>
+      <w:rPr/>
     </w:lvl>
     <w:lvl w:ilvl="8">
       <w:start w:val="1"/>
@@ -1363,6 +1573,7 @@
         </w:tabs>
         <w:ind w:start="3600" w:hanging="360"/>
       </w:pPr>
+      <w:rPr/>
     </w:lvl>
   </w:abstractNum>
   <w:abstractNum w:abstractNumId="7">
@@ -1513,7 +1724,7 @@
   <w:docDefaults>
     <w:rPrDefault>
       <w:rPr>
-        <w:rFonts w:ascii="Cambria" w:hAnsi="Cambria" w:eastAsia="ＭＳ 明朝" w:cs="" w:asciiTheme="minorHAnsi" w:cstheme="minorBidi" w:eastAsiaTheme="minorEastAsia" w:hAnsiTheme="minorHAnsi"/>
+        <w:rFonts w:ascii="Cambria" w:hAnsi="Cambria" w:eastAsia="" w:cs="" w:asciiTheme="minorHAnsi" w:cstheme="minorBidi" w:eastAsiaTheme="minorEastAsia" w:hAnsiTheme="minorHAnsi"/>
         <w:sz w:val="22"/>
         <w:szCs w:val="22"/>
         <w:lang w:val="en-US" w:eastAsia="en-US" w:bidi="ar-SA"/>
@@ -1670,12 +1881,13 @@
     <w:rsid w:val="00fc693f"/>
     <w:pPr>
       <w:widowControl/>
+      <w:suppressAutoHyphens w:val="true"/>
       <w:bidi w:val="0"/>
       <w:spacing w:lineRule="auto" w:line="276" w:before="0" w:after="200"/>
       <w:jc w:val="start"/>
     </w:pPr>
     <w:rPr>
-      <w:rFonts w:ascii="Calibri" w:hAnsi="Calibri" w:eastAsia="ＭＳ 明朝" w:cs="" w:cstheme="minorBidi" w:eastAsiaTheme="minorEastAsia"/>
+      <w:rFonts w:ascii="Calibri" w:hAnsi="Calibri" w:eastAsia="" w:cs="" w:cstheme="minorBidi" w:eastAsiaTheme="minorEastAsia"/>
       <w:color w:val="auto"/>
       <w:kern w:val="0"/>
       <w:sz w:val="21"/>
@@ -1698,7 +1910,7 @@
       <w:outlineLvl w:val="0"/>
     </w:pPr>
     <w:rPr>
-      <w:rFonts w:ascii="Calibri" w:hAnsi="Calibri" w:eastAsia="ＭＳ ゴシック" w:cs="" w:asciiTheme="majorHAnsi" w:cstheme="majorBidi" w:eastAsiaTheme="majorEastAsia" w:hAnsiTheme="majorHAnsi"/>
+      <w:rFonts w:ascii="Calibri" w:hAnsi="Calibri" w:eastAsia="" w:cs="" w:asciiTheme="majorHAnsi" w:cstheme="majorBidi" w:eastAsiaTheme="majorEastAsia" w:hAnsiTheme="majorHAnsi"/>
       <w:b/>
       <w:bCs/>
       <w:color w:themeColor="accent1" w:themeShade="bf" w:val="365F91"/>
@@ -1722,7 +1934,7 @@
       <w:outlineLvl w:val="1"/>
     </w:pPr>
     <w:rPr>
-      <w:rFonts w:ascii="Calibri" w:hAnsi="Calibri" w:eastAsia="ＭＳ ゴシック" w:cs="" w:asciiTheme="majorHAnsi" w:cstheme="majorBidi" w:eastAsiaTheme="majorEastAsia" w:hAnsiTheme="majorHAnsi"/>
+      <w:rFonts w:ascii="Calibri" w:hAnsi="Calibri" w:eastAsia="" w:cs="" w:asciiTheme="majorHAnsi" w:cstheme="majorBidi" w:eastAsiaTheme="majorEastAsia" w:hAnsiTheme="majorHAnsi"/>
       <w:b/>
       <w:bCs/>
       <w:color w:themeColor="accent1" w:val="4F81BD"/>
@@ -1746,7 +1958,7 @@
       <w:outlineLvl w:val="2"/>
     </w:pPr>
     <w:rPr>
-      <w:rFonts w:ascii="Calibri" w:hAnsi="Calibri" w:eastAsia="ＭＳ ゴシック" w:cs="" w:asciiTheme="majorHAnsi" w:cstheme="majorBidi" w:eastAsiaTheme="majorEastAsia" w:hAnsiTheme="majorHAnsi"/>
+      <w:rFonts w:ascii="Calibri" w:hAnsi="Calibri" w:eastAsia="" w:cs="" w:asciiTheme="majorHAnsi" w:cstheme="majorBidi" w:eastAsiaTheme="majorEastAsia" w:hAnsiTheme="majorHAnsi"/>
       <w:b/>
       <w:bCs/>
       <w:color w:themeColor="accent1" w:val="4F81BD"/>
@@ -1769,7 +1981,7 @@
       <w:outlineLvl w:val="3"/>
     </w:pPr>
     <w:rPr>
-      <w:rFonts w:ascii="Calibri" w:hAnsi="Calibri" w:eastAsia="ＭＳ ゴシック" w:cs="" w:asciiTheme="majorHAnsi" w:cstheme="majorBidi" w:eastAsiaTheme="majorEastAsia" w:hAnsiTheme="majorHAnsi"/>
+      <w:rFonts w:ascii="Calibri" w:hAnsi="Calibri" w:eastAsia="" w:cs="" w:asciiTheme="majorHAnsi" w:cstheme="majorBidi" w:eastAsiaTheme="majorEastAsia" w:hAnsiTheme="majorHAnsi"/>
       <w:b/>
       <w:bCs/>
       <w:i/>
@@ -1794,7 +2006,7 @@
       <w:outlineLvl w:val="4"/>
     </w:pPr>
     <w:rPr>
-      <w:rFonts w:ascii="Calibri" w:hAnsi="Calibri" w:eastAsia="ＭＳ ゴシック" w:cs="" w:asciiTheme="majorHAnsi" w:cstheme="majorBidi" w:eastAsiaTheme="majorEastAsia" w:hAnsiTheme="majorHAnsi"/>
+      <w:rFonts w:ascii="Calibri" w:hAnsi="Calibri" w:eastAsia="" w:cs="" w:asciiTheme="majorHAnsi" w:cstheme="majorBidi" w:eastAsiaTheme="majorEastAsia" w:hAnsiTheme="majorHAnsi"/>
       <w:color w:themeColor="accent1" w:themeShade="7f" w:val="243F60"/>
     </w:rPr>
   </w:style>
@@ -1815,7 +2027,7 @@
       <w:outlineLvl w:val="5"/>
     </w:pPr>
     <w:rPr>
-      <w:rFonts w:ascii="Calibri" w:hAnsi="Calibri" w:eastAsia="ＭＳ ゴシック" w:cs="" w:asciiTheme="majorHAnsi" w:cstheme="majorBidi" w:eastAsiaTheme="majorEastAsia" w:hAnsiTheme="majorHAnsi"/>
+      <w:rFonts w:ascii="Calibri" w:hAnsi="Calibri" w:eastAsia="" w:cs="" w:asciiTheme="majorHAnsi" w:cstheme="majorBidi" w:eastAsiaTheme="majorEastAsia" w:hAnsiTheme="majorHAnsi"/>
       <w:i/>
       <w:iCs/>
       <w:color w:themeColor="accent1" w:themeShade="7f" w:val="243F60"/>
@@ -1838,7 +2050,7 @@
       <w:outlineLvl w:val="6"/>
     </w:pPr>
     <w:rPr>
-      <w:rFonts w:ascii="Calibri" w:hAnsi="Calibri" w:eastAsia="ＭＳ ゴシック" w:cs="" w:asciiTheme="majorHAnsi" w:cstheme="majorBidi" w:eastAsiaTheme="majorEastAsia" w:hAnsiTheme="majorHAnsi"/>
+      <w:rFonts w:ascii="Calibri" w:hAnsi="Calibri" w:eastAsia="" w:cs="" w:asciiTheme="majorHAnsi" w:cstheme="majorBidi" w:eastAsiaTheme="majorEastAsia" w:hAnsiTheme="majorHAnsi"/>
       <w:i/>
       <w:iCs/>
       <w:color w:themeColor="text1" w:themeTint="bf" w:val="404040"/>
@@ -1861,7 +2073,7 @@
       <w:outlineLvl w:val="7"/>
     </w:pPr>
     <w:rPr>
-      <w:rFonts w:ascii="Calibri" w:hAnsi="Calibri" w:eastAsia="ＭＳ ゴシック" w:cs="" w:asciiTheme="majorHAnsi" w:cstheme="majorBidi" w:eastAsiaTheme="majorEastAsia" w:hAnsiTheme="majorHAnsi"/>
+      <w:rFonts w:ascii="Calibri" w:hAnsi="Calibri" w:eastAsia="" w:cs="" w:asciiTheme="majorHAnsi" w:cstheme="majorBidi" w:eastAsiaTheme="majorEastAsia" w:hAnsiTheme="majorHAnsi"/>
       <w:color w:themeColor="accent1" w:val="4F81BD"/>
       <w:sz w:val="20"/>
       <w:szCs w:val="20"/>
@@ -1884,7 +2096,7 @@
       <w:outlineLvl w:val="8"/>
     </w:pPr>
     <w:rPr>
-      <w:rFonts w:ascii="Calibri" w:hAnsi="Calibri" w:eastAsia="ＭＳ ゴシック" w:cs="" w:asciiTheme="majorHAnsi" w:cstheme="majorBidi" w:eastAsiaTheme="majorEastAsia" w:hAnsiTheme="majorHAnsi"/>
+      <w:rFonts w:ascii="Calibri" w:hAnsi="Calibri" w:eastAsia="" w:cs="" w:asciiTheme="majorHAnsi" w:cstheme="majorBidi" w:eastAsiaTheme="majorEastAsia" w:hAnsiTheme="majorHAnsi"/>
       <w:i/>
       <w:iCs/>
       <w:color w:themeColor="text1" w:themeTint="bf" w:val="404040"/>
@@ -1926,7 +2138,7 @@
     <w:qFormat/>
     <w:rsid w:val="00fc693f"/>
     <w:rPr>
-      <w:rFonts w:ascii="Calibri" w:hAnsi="Calibri" w:eastAsia="ＭＳ ゴシック" w:cs="" w:asciiTheme="majorHAnsi" w:cstheme="majorBidi" w:eastAsiaTheme="majorEastAsia" w:hAnsiTheme="majorHAnsi"/>
+      <w:rFonts w:ascii="Calibri" w:hAnsi="Calibri" w:eastAsia="" w:cs="" w:asciiTheme="majorHAnsi" w:cstheme="majorBidi" w:eastAsiaTheme="majorEastAsia" w:hAnsiTheme="majorHAnsi"/>
       <w:b/>
       <w:bCs/>
       <w:color w:themeColor="accent1" w:themeShade="bf" w:val="365F91"/>
@@ -1942,7 +2154,7 @@
     <w:qFormat/>
     <w:rsid w:val="00fc693f"/>
     <w:rPr>
-      <w:rFonts w:ascii="Calibri" w:hAnsi="Calibri" w:eastAsia="ＭＳ ゴシック" w:cs="" w:asciiTheme="majorHAnsi" w:cstheme="majorBidi" w:eastAsiaTheme="majorEastAsia" w:hAnsiTheme="majorHAnsi"/>
+      <w:rFonts w:ascii="Calibri" w:hAnsi="Calibri" w:eastAsia="" w:cs="" w:asciiTheme="majorHAnsi" w:cstheme="majorBidi" w:eastAsiaTheme="majorEastAsia" w:hAnsiTheme="majorHAnsi"/>
       <w:b/>
       <w:bCs/>
       <w:color w:themeColor="accent1" w:val="4F81BD"/>
@@ -1958,7 +2170,7 @@
     <w:qFormat/>
     <w:rsid w:val="00fc693f"/>
     <w:rPr>
-      <w:rFonts w:ascii="Calibri" w:hAnsi="Calibri" w:eastAsia="ＭＳ ゴシック" w:cs="" w:asciiTheme="majorHAnsi" w:cstheme="majorBidi" w:eastAsiaTheme="majorEastAsia" w:hAnsiTheme="majorHAnsi"/>
+      <w:rFonts w:ascii="Calibri" w:hAnsi="Calibri" w:eastAsia="" w:cs="" w:asciiTheme="majorHAnsi" w:cstheme="majorBidi" w:eastAsiaTheme="majorEastAsia" w:hAnsiTheme="majorHAnsi"/>
       <w:b/>
       <w:bCs/>
       <w:color w:themeColor="accent1" w:val="4F81BD"/>
@@ -1972,7 +2184,7 @@
     <w:qFormat/>
     <w:rsid w:val="00fc693f"/>
     <w:rPr>
-      <w:rFonts w:ascii="Calibri" w:hAnsi="Calibri" w:eastAsia="ＭＳ ゴシック" w:cs="" w:asciiTheme="majorHAnsi" w:cstheme="majorBidi" w:eastAsiaTheme="majorEastAsia" w:hAnsiTheme="majorHAnsi"/>
+      <w:rFonts w:ascii="Calibri" w:hAnsi="Calibri" w:eastAsia="" w:cs="" w:asciiTheme="majorHAnsi" w:cstheme="majorBidi" w:eastAsiaTheme="majorEastAsia" w:hAnsiTheme="majorHAnsi"/>
       <w:color w:themeColor="text2" w:themeShade="bf" w:val="17365D"/>
       <w:spacing w:val="5"/>
       <w:kern w:val="2"/>
@@ -1988,7 +2200,7 @@
     <w:qFormat/>
     <w:rsid w:val="00fc693f"/>
     <w:rPr>
-      <w:rFonts w:ascii="Calibri" w:hAnsi="Calibri" w:eastAsia="ＭＳ ゴシック" w:cs="" w:asciiTheme="majorHAnsi" w:cstheme="majorBidi" w:eastAsiaTheme="majorEastAsia" w:hAnsiTheme="majorHAnsi"/>
+      <w:rFonts w:ascii="Calibri" w:hAnsi="Calibri" w:eastAsia="" w:cs="" w:asciiTheme="majorHAnsi" w:cstheme="majorBidi" w:eastAsiaTheme="majorEastAsia" w:hAnsiTheme="majorHAnsi"/>
       <w:i/>
       <w:iCs/>
       <w:color w:themeColor="accent1" w:val="4F81BD"/>
@@ -2061,7 +2273,7 @@
     <w:qFormat/>
     <w:rsid w:val="00fc693f"/>
     <w:rPr>
-      <w:rFonts w:ascii="Calibri" w:hAnsi="Calibri" w:eastAsia="ＭＳ ゴシック" w:cs="" w:asciiTheme="majorHAnsi" w:cstheme="majorBidi" w:eastAsiaTheme="majorEastAsia" w:hAnsiTheme="majorHAnsi"/>
+      <w:rFonts w:ascii="Calibri" w:hAnsi="Calibri" w:eastAsia="" w:cs="" w:asciiTheme="majorHAnsi" w:cstheme="majorBidi" w:eastAsiaTheme="majorEastAsia" w:hAnsiTheme="majorHAnsi"/>
       <w:b/>
       <w:bCs/>
       <w:i/>
@@ -2078,7 +2290,7 @@
     <w:qFormat/>
     <w:rsid w:val="00fc693f"/>
     <w:rPr>
-      <w:rFonts w:ascii="Calibri" w:hAnsi="Calibri" w:eastAsia="ＭＳ ゴシック" w:cs="" w:asciiTheme="majorHAnsi" w:cstheme="majorBidi" w:eastAsiaTheme="majorEastAsia" w:hAnsiTheme="majorHAnsi"/>
+      <w:rFonts w:ascii="Calibri" w:hAnsi="Calibri" w:eastAsia="" w:cs="" w:asciiTheme="majorHAnsi" w:cstheme="majorBidi" w:eastAsiaTheme="majorEastAsia" w:hAnsiTheme="majorHAnsi"/>
       <w:color w:themeColor="accent1" w:themeShade="7f" w:val="243F60"/>
     </w:rPr>
   </w:style>
@@ -2091,7 +2303,7 @@
     <w:qFormat/>
     <w:rsid w:val="00fc693f"/>
     <w:rPr>
-      <w:rFonts w:ascii="Calibri" w:hAnsi="Calibri" w:eastAsia="ＭＳ ゴシック" w:cs="" w:asciiTheme="majorHAnsi" w:cstheme="majorBidi" w:eastAsiaTheme="majorEastAsia" w:hAnsiTheme="majorHAnsi"/>
+      <w:rFonts w:ascii="Calibri" w:hAnsi="Calibri" w:eastAsia="" w:cs="" w:asciiTheme="majorHAnsi" w:cstheme="majorBidi" w:eastAsiaTheme="majorEastAsia" w:hAnsiTheme="majorHAnsi"/>
       <w:i/>
       <w:iCs/>
       <w:color w:themeColor="accent1" w:themeShade="7f" w:val="243F60"/>
@@ -2106,7 +2318,7 @@
     <w:qFormat/>
     <w:rsid w:val="00fc693f"/>
     <w:rPr>
-      <w:rFonts w:ascii="Calibri" w:hAnsi="Calibri" w:eastAsia="ＭＳ ゴシック" w:cs="" w:asciiTheme="majorHAnsi" w:cstheme="majorBidi" w:eastAsiaTheme="majorEastAsia" w:hAnsiTheme="majorHAnsi"/>
+      <w:rFonts w:ascii="Calibri" w:hAnsi="Calibri" w:eastAsia="" w:cs="" w:asciiTheme="majorHAnsi" w:cstheme="majorBidi" w:eastAsiaTheme="majorEastAsia" w:hAnsiTheme="majorHAnsi"/>
       <w:i/>
       <w:iCs/>
       <w:color w:themeColor="text1" w:themeTint="bf" w:val="404040"/>
@@ -2121,7 +2333,7 @@
     <w:qFormat/>
     <w:rsid w:val="00fc693f"/>
     <w:rPr>
-      <w:rFonts w:ascii="Calibri" w:hAnsi="Calibri" w:eastAsia="ＭＳ ゴシック" w:cs="" w:asciiTheme="majorHAnsi" w:cstheme="majorBidi" w:eastAsiaTheme="majorEastAsia" w:hAnsiTheme="majorHAnsi"/>
+      <w:rFonts w:ascii="Calibri" w:hAnsi="Calibri" w:eastAsia="" w:cs="" w:asciiTheme="majorHAnsi" w:cstheme="majorBidi" w:eastAsiaTheme="majorEastAsia" w:hAnsiTheme="majorHAnsi"/>
       <w:color w:themeColor="accent1" w:val="4F81BD"/>
       <w:sz w:val="20"/>
       <w:szCs w:val="20"/>
@@ -2136,7 +2348,7 @@
     <w:qFormat/>
     <w:rsid w:val="00fc693f"/>
     <w:rPr>
-      <w:rFonts w:ascii="Calibri" w:hAnsi="Calibri" w:eastAsia="ＭＳ ゴシック" w:cs="" w:asciiTheme="majorHAnsi" w:cstheme="majorBidi" w:eastAsiaTheme="majorEastAsia" w:hAnsiTheme="majorHAnsi"/>
+      <w:rFonts w:ascii="Calibri" w:hAnsi="Calibri" w:eastAsia="" w:cs="" w:asciiTheme="majorHAnsi" w:cstheme="majorBidi" w:eastAsiaTheme="majorEastAsia" w:hAnsiTheme="majorHAnsi"/>
       <w:i/>
       <w:iCs/>
       <w:color w:themeColor="text1" w:themeTint="bf" w:val="404040"/>
@@ -2366,12 +2578,13 @@
     <w:rsid w:val="00fc693f"/>
     <w:pPr>
       <w:widowControl/>
+      <w:suppressAutoHyphens w:val="true"/>
       <w:bidi w:val="0"/>
       <w:spacing w:lineRule="auto" w:line="240" w:before="0" w:after="0"/>
       <w:jc w:val="start"/>
     </w:pPr>
     <w:rPr>
-      <w:rFonts w:ascii="Cambria" w:hAnsi="Cambria" w:eastAsia="ＭＳ 明朝" w:cs="" w:asciiTheme="minorHAnsi" w:cstheme="minorBidi" w:eastAsiaTheme="minorEastAsia" w:hAnsiTheme="minorHAnsi"/>
+      <w:rFonts w:ascii="Cambria" w:hAnsi="Cambria" w:eastAsia="" w:cs="" w:asciiTheme="minorHAnsi" w:cstheme="minorBidi" w:eastAsiaTheme="minorEastAsia" w:hAnsiTheme="minorHAnsi"/>
       <w:color w:val="auto"/>
       <w:kern w:val="0"/>
       <w:sz w:val="22"/>
@@ -2395,7 +2608,7 @@
       <w:contextualSpacing/>
     </w:pPr>
     <w:rPr>
-      <w:rFonts w:ascii="Calibri" w:hAnsi="Calibri" w:eastAsia="ＭＳ ゴシック" w:cs="" w:asciiTheme="majorHAnsi" w:cstheme="majorBidi" w:eastAsiaTheme="majorEastAsia" w:hAnsiTheme="majorHAnsi"/>
+      <w:rFonts w:ascii="Calibri" w:hAnsi="Calibri" w:eastAsia="" w:cs="" w:asciiTheme="majorHAnsi" w:cstheme="majorBidi" w:eastAsiaTheme="majorEastAsia" w:hAnsiTheme="majorHAnsi"/>
       <w:color w:themeColor="text2" w:themeShade="bf" w:val="17365D"/>
       <w:spacing w:val="5"/>
       <w:kern w:val="2"/>
@@ -2413,7 +2626,7 @@
     <w:rsid w:val="00fc693f"/>
     <w:pPr/>
     <w:rPr>
-      <w:rFonts w:ascii="Calibri" w:hAnsi="Calibri" w:eastAsia="ＭＳ ゴシック" w:cs="" w:asciiTheme="majorHAnsi" w:cstheme="majorBidi" w:eastAsiaTheme="majorEastAsia" w:hAnsiTheme="majorHAnsi"/>
+      <w:rFonts w:ascii="Calibri" w:hAnsi="Calibri" w:eastAsia="" w:cs="" w:asciiTheme="majorHAnsi" w:cstheme="majorBidi" w:eastAsiaTheme="majorEastAsia" w:hAnsiTheme="majorHAnsi"/>
       <w:i/>
       <w:iCs/>
       <w:color w:themeColor="accent1" w:val="4F81BD"/>
@@ -2646,12 +2859,13 @@
         <w:tab w:val="left" w:pos="3456" w:leader="none"/>
         <w:tab w:val="left" w:pos="4032" w:leader="none"/>
       </w:tabs>
+      <w:suppressAutoHyphens w:val="true"/>
       <w:bidi w:val="0"/>
       <w:spacing w:lineRule="auto" w:line="276" w:before="0" w:after="200"/>
       <w:jc w:val="start"/>
     </w:pPr>
     <w:rPr>
-      <w:rFonts w:ascii="Courier" w:hAnsi="Courier" w:eastAsia="ＭＳ 明朝" w:cs="" w:cstheme="minorBidi" w:eastAsiaTheme="minorEastAsia"/>
+      <w:rFonts w:ascii="Courier" w:hAnsi="Courier" w:eastAsia="" w:cs="" w:cstheme="minorBidi" w:eastAsiaTheme="minorEastAsia"/>
       <w:color w:val="auto"/>
       <w:kern w:val="0"/>
       <w:sz w:val="20"/>
@@ -5849,7 +6063,6 @@
       <w:pPr>
         <w:spacing w:before="0" w:after="0" w:line="240" w:lineRule="auto"/>
       </w:pPr>
-      <w:rPr/>
       <w:tblPr/>
       <w:tcPr>
         <w:tcBorders>
@@ -5995,7 +6208,6 @@
       <w:pPr>
         <w:spacing w:before="0" w:after="0" w:line="240" w:lineRule="auto"/>
       </w:pPr>
-      <w:rPr/>
       <w:tblPr/>
       <w:tcPr>
         <w:tcBorders>
@@ -6141,7 +6353,6 @@
       <w:pPr>
         <w:spacing w:before="0" w:after="0" w:line="240" w:lineRule="auto"/>
       </w:pPr>
-      <w:rPr/>
       <w:tblPr/>
       <w:tcPr>
         <w:tcBorders>
@@ -6287,7 +6498,6 @@
       <w:pPr>
         <w:spacing w:before="0" w:after="0" w:line="240" w:lineRule="auto"/>
       </w:pPr>
-      <w:rPr/>
       <w:tblPr/>
       <w:tcPr>
         <w:tcBorders>
@@ -6433,7 +6643,6 @@
       <w:pPr>
         <w:spacing w:before="0" w:after="0" w:line="240" w:lineRule="auto"/>
       </w:pPr>
-      <w:rPr/>
       <w:tblPr/>
       <w:tcPr>
         <w:tcBorders>
@@ -6579,7 +6788,6 @@
       <w:pPr>
         <w:spacing w:before="0" w:after="0" w:line="240" w:lineRule="auto"/>
       </w:pPr>
-      <w:rPr/>
       <w:tblPr/>
       <w:tcPr>
         <w:tcBorders>
@@ -6725,7 +6933,6 @@
       <w:pPr>
         <w:spacing w:before="0" w:after="0" w:line="240" w:lineRule="auto"/>
       </w:pPr>
-      <w:rPr/>
       <w:tblPr/>
       <w:tcPr>
         <w:tcBorders>

</xml_diff>